<commit_message>
Improve guide dataset feasibility plan
</commit_message>
<xml_diff>
--- a/outputs/guide_review_pack/04_dataset_feasibility_and_data_requirements.docx
+++ b/outputs/guide_review_pack/04_dataset_feasibility_and_data_requirements.docx
@@ -37,7 +37,806 @@
     </w:p>
     <w:p>
       <w:r>
-        <w:t>The final PhD topic depends heavily on clinic data access. This document identifies the minimum, strong and ideal data scenarios.</w:t>
+        <w:t>The final PhD topic depends heavily on clinic data access. This document converts dataset uncertainty into a decision plan: what minimum data are needed, what stronger data would improve the study, and which title words should remain conditional.</w:t>
+      </w:r>
+    </w:p>
+    <w:p>
+      <w:pPr>
+        <w:pStyle w:val="Heading1"/>
+      </w:pPr>
+      <w:r>
+        <w:t>Core Decision Gates</w:t>
+      </w:r>
+    </w:p>
+    <w:tbl>
+      <w:tblPr>
+        <w:tblStyle w:val="TableGrid"/>
+        <w:tblW w:type="auto" w:w="0"/>
+        <w:jc w:val="center"/>
+        <w:tblLook w:firstColumn="1" w:firstRow="1" w:lastColumn="0" w:lastRow="0" w:noHBand="0" w:noVBand="1" w:val="04A0"/>
+      </w:tblPr>
+      <w:tblGrid>
+        <w:gridCol w:w="3120"/>
+        <w:gridCol w:w="3120"/>
+        <w:gridCol w:w="3120"/>
+      </w:tblGrid>
+      <w:tr>
+        <w:tc>
+          <w:tcPr>
+            <w:tcW w:type="dxa" w:w="2808"/>
+            <w:shd w:fill="F2F4F7"/>
+            <w:vAlign w:val="center"/>
+          </w:tcPr>
+          <w:p>
+            <w:pPr>
+              <w:spacing w:after="0"/>
+            </w:pPr>
+            <w:r/>
+            <w:r>
+              <w:rPr>
+                <w:rFonts w:ascii="Calibri" w:hAnsi="Calibri"/>
+                <w:b/>
+                <w:sz w:val="18"/>
+              </w:rPr>
+              <w:t>Decision Question</w:t>
+            </w:r>
+          </w:p>
+        </w:tc>
+        <w:tc>
+          <w:tcPr>
+            <w:tcW w:type="dxa" w:w="3168"/>
+            <w:shd w:fill="F2F4F7"/>
+            <w:vAlign w:val="center"/>
+          </w:tcPr>
+          <w:p>
+            <w:pPr>
+              <w:spacing w:after="0"/>
+            </w:pPr>
+            <w:r/>
+            <w:r>
+              <w:rPr>
+                <w:rFonts w:ascii="Calibri" w:hAnsi="Calibri"/>
+                <w:b/>
+                <w:sz w:val="18"/>
+              </w:rPr>
+              <w:t>If Yes</w:t>
+            </w:r>
+          </w:p>
+        </w:tc>
+        <w:tc>
+          <w:tcPr>
+            <w:tcW w:type="dxa" w:w="3096"/>
+            <w:shd w:fill="F2F4F7"/>
+            <w:vAlign w:val="center"/>
+          </w:tcPr>
+          <w:p>
+            <w:pPr>
+              <w:spacing w:after="0"/>
+            </w:pPr>
+            <w:r/>
+            <w:r>
+              <w:rPr>
+                <w:rFonts w:ascii="Calibri" w:hAnsi="Calibri"/>
+                <w:b/>
+                <w:sz w:val="18"/>
+              </w:rPr>
+              <w:t>If No</w:t>
+            </w:r>
+          </w:p>
+        </w:tc>
+      </w:tr>
+      <w:tr>
+        <w:tc>
+          <w:tcPr>
+            <w:tcW w:type="dxa" w:w="2808"/>
+            <w:vAlign w:val="center"/>
+          </w:tcPr>
+          <w:p>
+            <w:pPr>
+              <w:spacing w:after="0"/>
+            </w:pPr>
+            <w:r/>
+            <w:r>
+              <w:rPr>
+                <w:rFonts w:ascii="Calibri" w:hAnsi="Calibri"/>
+                <w:b w:val="0"/>
+                <w:sz w:val="18"/>
+              </w:rPr>
+              <w:t>Can IVF clinical data be accessed?</w:t>
+            </w:r>
+          </w:p>
+        </w:tc>
+        <w:tc>
+          <w:tcPr>
+            <w:tcW w:type="dxa" w:w="3168"/>
+            <w:vAlign w:val="center"/>
+          </w:tcPr>
+          <w:p>
+            <w:pPr>
+              <w:spacing w:after="0"/>
+            </w:pPr>
+            <w:r/>
+            <w:r>
+              <w:rPr>
+                <w:rFonts w:ascii="Calibri" w:hAnsi="Calibri"/>
+                <w:b w:val="0"/>
+                <w:sz w:val="18"/>
+              </w:rPr>
+              <w:t>A basic explainable IVF outcome prediction study is feasible.</w:t>
+            </w:r>
+          </w:p>
+        </w:tc>
+        <w:tc>
+          <w:tcPr>
+            <w:tcW w:type="dxa" w:w="3096"/>
+            <w:vAlign w:val="center"/>
+          </w:tcPr>
+          <w:p>
+            <w:pPr>
+              <w:spacing w:after="0"/>
+            </w:pPr>
+            <w:r/>
+            <w:r>
+              <w:rPr>
+                <w:rFonts w:ascii="Calibri" w:hAnsi="Calibri"/>
+                <w:b w:val="0"/>
+                <w:sz w:val="18"/>
+              </w:rPr>
+              <w:t>The current topic cannot move forward practically; need another clinic/source.</w:t>
+            </w:r>
+          </w:p>
+        </w:tc>
+      </w:tr>
+      <w:tr>
+        <w:tc>
+          <w:tcPr>
+            <w:tcW w:type="dxa" w:w="2808"/>
+            <w:vAlign w:val="center"/>
+          </w:tcPr>
+          <w:p>
+            <w:pPr>
+              <w:spacing w:after="0"/>
+            </w:pPr>
+            <w:r/>
+            <w:r>
+              <w:rPr>
+                <w:rFonts w:ascii="Calibri" w:hAnsi="Calibri"/>
+                <w:b w:val="0"/>
+                <w:sz w:val="18"/>
+              </w:rPr>
+              <w:t>Is a clear outcome available?</w:t>
+            </w:r>
+          </w:p>
+        </w:tc>
+        <w:tc>
+          <w:tcPr>
+            <w:tcW w:type="dxa" w:w="3168"/>
+            <w:vAlign w:val="center"/>
+          </w:tcPr>
+          <w:p>
+            <w:pPr>
+              <w:spacing w:after="0"/>
+            </w:pPr>
+            <w:r/>
+            <w:r>
+              <w:rPr>
+                <w:rFonts w:ascii="Calibri" w:hAnsi="Calibri"/>
+                <w:b w:val="0"/>
+                <w:sz w:val="18"/>
+              </w:rPr>
+              <w:t>Model target can be defined: clinical pregnancy, live birth, miscarriage or oocyte/embryo response.</w:t>
+            </w:r>
+          </w:p>
+        </w:tc>
+        <w:tc>
+          <w:tcPr>
+            <w:tcW w:type="dxa" w:w="3096"/>
+            <w:vAlign w:val="center"/>
+          </w:tcPr>
+          <w:p>
+            <w:pPr>
+              <w:spacing w:after="0"/>
+            </w:pPr>
+            <w:r/>
+            <w:r>
+              <w:rPr>
+                <w:rFonts w:ascii="Calibri" w:hAnsi="Calibri"/>
+                <w:b w:val="0"/>
+                <w:sz w:val="18"/>
+              </w:rPr>
+              <w:t>Prediction study is weak; outcome definition must be solved first.</w:t>
+            </w:r>
+          </w:p>
+        </w:tc>
+      </w:tr>
+      <w:tr>
+        <w:tc>
+          <w:tcPr>
+            <w:tcW w:type="dxa" w:w="2808"/>
+            <w:vAlign w:val="center"/>
+          </w:tcPr>
+          <w:p>
+            <w:pPr>
+              <w:spacing w:after="0"/>
+            </w:pPr>
+            <w:r/>
+            <w:r>
+              <w:rPr>
+                <w:rFonts w:ascii="Calibri" w:hAnsi="Calibri"/>
+                <w:b w:val="0"/>
+                <w:sz w:val="18"/>
+              </w:rPr>
+              <w:t>Are embryology variables available?</w:t>
+            </w:r>
+          </w:p>
+        </w:tc>
+        <w:tc>
+          <w:tcPr>
+            <w:tcW w:type="dxa" w:w="3168"/>
+            <w:vAlign w:val="center"/>
+          </w:tcPr>
+          <w:p>
+            <w:pPr>
+              <w:spacing w:after="0"/>
+            </w:pPr>
+            <w:r/>
+            <w:r>
+              <w:rPr>
+                <w:rFonts w:ascii="Calibri" w:hAnsi="Calibri"/>
+                <w:b w:val="0"/>
+                <w:sz w:val="18"/>
+              </w:rPr>
+              <w:t>The title may include multimodal clinical and embryological data.</w:t>
+            </w:r>
+          </w:p>
+        </w:tc>
+        <w:tc>
+          <w:tcPr>
+            <w:tcW w:type="dxa" w:w="3096"/>
+            <w:vAlign w:val="center"/>
+          </w:tcPr>
+          <w:p>
+            <w:pPr>
+              <w:spacing w:after="0"/>
+            </w:pPr>
+            <w:r/>
+            <w:r>
+              <w:rPr>
+                <w:rFonts w:ascii="Calibri" w:hAnsi="Calibri"/>
+                <w:b w:val="0"/>
+                <w:sz w:val="18"/>
+              </w:rPr>
+              <w:t>Use clinical data only; keep embryology as future scope.</w:t>
+            </w:r>
+          </w:p>
+        </w:tc>
+      </w:tr>
+      <w:tr>
+        <w:tc>
+          <w:tcPr>
+            <w:tcW w:type="dxa" w:w="2808"/>
+            <w:vAlign w:val="center"/>
+          </w:tcPr>
+          <w:p>
+            <w:pPr>
+              <w:spacing w:after="0"/>
+            </w:pPr>
+            <w:r/>
+            <w:r>
+              <w:rPr>
+                <w:rFonts w:ascii="Calibri" w:hAnsi="Calibri"/>
+                <w:b w:val="0"/>
+                <w:sz w:val="18"/>
+              </w:rPr>
+              <w:t>Are lifestyle variables available or collectable?</w:t>
+            </w:r>
+          </w:p>
+        </w:tc>
+        <w:tc>
+          <w:tcPr>
+            <w:tcW w:type="dxa" w:w="3168"/>
+            <w:vAlign w:val="center"/>
+          </w:tcPr>
+          <w:p>
+            <w:pPr>
+              <w:spacing w:after="0"/>
+            </w:pPr>
+            <w:r/>
+            <w:r>
+              <w:rPr>
+                <w:rFonts w:ascii="Calibri" w:hAnsi="Calibri"/>
+                <w:b w:val="0"/>
+                <w:sz w:val="18"/>
+              </w:rPr>
+              <w:t>Lifestyle personalization can be explored carefully.</w:t>
+            </w:r>
+          </w:p>
+        </w:tc>
+        <w:tc>
+          <w:tcPr>
+            <w:tcW w:type="dxa" w:w="3096"/>
+            <w:vAlign w:val="center"/>
+          </w:tcPr>
+          <w:p>
+            <w:pPr>
+              <w:spacing w:after="0"/>
+            </w:pPr>
+            <w:r/>
+            <w:r>
+              <w:rPr>
+                <w:rFonts w:ascii="Calibri" w:hAnsi="Calibri"/>
+                <w:b w:val="0"/>
+                <w:sz w:val="18"/>
+              </w:rPr>
+              <w:t>Do not include lifestyle in the title.</w:t>
+            </w:r>
+          </w:p>
+        </w:tc>
+      </w:tr>
+      <w:tr>
+        <w:tc>
+          <w:tcPr>
+            <w:tcW w:type="dxa" w:w="2808"/>
+            <w:vAlign w:val="center"/>
+          </w:tcPr>
+          <w:p>
+            <w:pPr>
+              <w:spacing w:after="0"/>
+            </w:pPr>
+            <w:r/>
+            <w:r>
+              <w:rPr>
+                <w:rFonts w:ascii="Calibri" w:hAnsi="Calibri"/>
+                <w:b w:val="0"/>
+                <w:sz w:val="18"/>
+              </w:rPr>
+              <w:t>Is independent validation possible?</w:t>
+            </w:r>
+          </w:p>
+        </w:tc>
+        <w:tc>
+          <w:tcPr>
+            <w:tcW w:type="dxa" w:w="3168"/>
+            <w:vAlign w:val="center"/>
+          </w:tcPr>
+          <w:p>
+            <w:pPr>
+              <w:spacing w:after="0"/>
+            </w:pPr>
+            <w:r/>
+            <w:r>
+              <w:rPr>
+                <w:rFonts w:ascii="Calibri" w:hAnsi="Calibri"/>
+                <w:b w:val="0"/>
+                <w:sz w:val="18"/>
+              </w:rPr>
+              <w:t>External, clinic-wise or temporal validation can be claimed depending on source.</w:t>
+            </w:r>
+          </w:p>
+        </w:tc>
+        <w:tc>
+          <w:tcPr>
+            <w:tcW w:type="dxa" w:w="3096"/>
+            <w:vAlign w:val="center"/>
+          </w:tcPr>
+          <w:p>
+            <w:pPr>
+              <w:spacing w:after="0"/>
+            </w:pPr>
+            <w:r/>
+            <w:r>
+              <w:rPr>
+                <w:rFonts w:ascii="Calibri" w:hAnsi="Calibri"/>
+                <w:b w:val="0"/>
+                <w:sz w:val="18"/>
+              </w:rPr>
+              <w:t>Use internal validation and clearly state limitation.</w:t>
+            </w:r>
+          </w:p>
+        </w:tc>
+      </w:tr>
+      <w:tr>
+        <w:tc>
+          <w:tcPr>
+            <w:tcW w:type="dxa" w:w="2808"/>
+            <w:vAlign w:val="center"/>
+          </w:tcPr>
+          <w:p>
+            <w:pPr>
+              <w:spacing w:after="0"/>
+            </w:pPr>
+            <w:r/>
+            <w:r>
+              <w:rPr>
+                <w:rFonts w:ascii="Calibri" w:hAnsi="Calibri"/>
+                <w:b w:val="0"/>
+                <w:sz w:val="18"/>
+              </w:rPr>
+              <w:t>Can doctors review explanation outputs?</w:t>
+            </w:r>
+          </w:p>
+        </w:tc>
+        <w:tc>
+          <w:tcPr>
+            <w:tcW w:type="dxa" w:w="3168"/>
+            <w:vAlign w:val="center"/>
+          </w:tcPr>
+          <w:p>
+            <w:pPr>
+              <w:spacing w:after="0"/>
+            </w:pPr>
+            <w:r/>
+            <w:r>
+              <w:rPr>
+                <w:rFonts w:ascii="Calibri" w:hAnsi="Calibri"/>
+                <w:b w:val="0"/>
+                <w:sz w:val="18"/>
+              </w:rPr>
+              <w:t>Clinician usefulness/usability can become an objective.</w:t>
+            </w:r>
+          </w:p>
+        </w:tc>
+        <w:tc>
+          <w:tcPr>
+            <w:tcW w:type="dxa" w:w="3096"/>
+            <w:vAlign w:val="center"/>
+          </w:tcPr>
+          <w:p>
+            <w:pPr>
+              <w:spacing w:after="0"/>
+            </w:pPr>
+            <w:r/>
+            <w:r>
+              <w:rPr>
+                <w:rFonts w:ascii="Calibri" w:hAnsi="Calibri"/>
+                <w:b w:val="0"/>
+                <w:sz w:val="18"/>
+              </w:rPr>
+              <w:t>Keep CDSS as a proposed framework, not clinically evaluated deployment.</w:t>
+            </w:r>
+          </w:p>
+        </w:tc>
+      </w:tr>
+    </w:tbl>
+    <w:p/>
+    <w:p>
+      <w:pPr>
+        <w:pStyle w:val="Heading1"/>
+      </w:pPr>
+      <w:r>
+        <w:t>Variable Priority Levels</w:t>
+      </w:r>
+    </w:p>
+    <w:tbl>
+      <w:tblPr>
+        <w:tblStyle w:val="TableGrid"/>
+        <w:tblW w:type="auto" w:w="0"/>
+        <w:jc w:val="center"/>
+        <w:tblLook w:firstColumn="1" w:firstRow="1" w:lastColumn="0" w:lastRow="0" w:noHBand="0" w:noVBand="1" w:val="04A0"/>
+      </w:tblPr>
+      <w:tblGrid>
+        <w:gridCol w:w="3120"/>
+        <w:gridCol w:w="3120"/>
+        <w:gridCol w:w="3120"/>
+      </w:tblGrid>
+      <w:tr>
+        <w:tc>
+          <w:tcPr>
+            <w:tcW w:type="dxa" w:w="1728"/>
+            <w:shd w:fill="F2F4F7"/>
+            <w:vAlign w:val="center"/>
+          </w:tcPr>
+          <w:p>
+            <w:pPr>
+              <w:spacing w:after="0"/>
+            </w:pPr>
+            <w:r/>
+            <w:r>
+              <w:rPr>
+                <w:rFonts w:ascii="Calibri" w:hAnsi="Calibri"/>
+                <w:b/>
+                <w:sz w:val="18"/>
+              </w:rPr>
+              <w:t>Level</w:t>
+            </w:r>
+          </w:p>
+        </w:tc>
+        <w:tc>
+          <w:tcPr>
+            <w:tcW w:type="dxa" w:w="3816"/>
+            <w:shd w:fill="F2F4F7"/>
+            <w:vAlign w:val="center"/>
+          </w:tcPr>
+          <w:p>
+            <w:pPr>
+              <w:spacing w:after="0"/>
+            </w:pPr>
+            <w:r/>
+            <w:r>
+              <w:rPr>
+                <w:rFonts w:ascii="Calibri" w:hAnsi="Calibri"/>
+                <w:b/>
+                <w:sz w:val="18"/>
+              </w:rPr>
+              <w:t>Meaning</w:t>
+            </w:r>
+          </w:p>
+        </w:tc>
+        <w:tc>
+          <w:tcPr>
+            <w:tcW w:type="dxa" w:w="3528"/>
+            <w:shd w:fill="F2F4F7"/>
+            <w:vAlign w:val="center"/>
+          </w:tcPr>
+          <w:p>
+            <w:pPr>
+              <w:spacing w:after="0"/>
+            </w:pPr>
+            <w:r/>
+            <w:r>
+              <w:rPr>
+                <w:rFonts w:ascii="Calibri" w:hAnsi="Calibri"/>
+                <w:b/>
+                <w:sz w:val="18"/>
+              </w:rPr>
+              <w:t>Example</w:t>
+            </w:r>
+          </w:p>
+        </w:tc>
+      </w:tr>
+      <w:tr>
+        <w:tc>
+          <w:tcPr>
+            <w:tcW w:type="dxa" w:w="1728"/>
+            <w:vAlign w:val="center"/>
+          </w:tcPr>
+          <w:p>
+            <w:pPr>
+              <w:spacing w:after="0"/>
+            </w:pPr>
+            <w:r/>
+            <w:r>
+              <w:rPr>
+                <w:rFonts w:ascii="Calibri" w:hAnsi="Calibri"/>
+                <w:b w:val="0"/>
+                <w:sz w:val="18"/>
+              </w:rPr>
+              <w:t>Mandatory</w:t>
+            </w:r>
+          </w:p>
+        </w:tc>
+        <w:tc>
+          <w:tcPr>
+            <w:tcW w:type="dxa" w:w="3816"/>
+            <w:vAlign w:val="center"/>
+          </w:tcPr>
+          <w:p>
+            <w:pPr>
+              <w:spacing w:after="0"/>
+            </w:pPr>
+            <w:r/>
+            <w:r>
+              <w:rPr>
+                <w:rFonts w:ascii="Calibri" w:hAnsi="Calibri"/>
+                <w:b w:val="0"/>
+                <w:sz w:val="18"/>
+              </w:rPr>
+              <w:t>Minimum variables required for a defensible IVF outcome-prediction model.</w:t>
+            </w:r>
+          </w:p>
+        </w:tc>
+        <w:tc>
+          <w:tcPr>
+            <w:tcW w:type="dxa" w:w="3528"/>
+            <w:vAlign w:val="center"/>
+          </w:tcPr>
+          <w:p>
+            <w:pPr>
+              <w:spacing w:after="0"/>
+            </w:pPr>
+            <w:r/>
+            <w:r>
+              <w:rPr>
+                <w:rFonts w:ascii="Calibri" w:hAnsi="Calibri"/>
+                <w:b w:val="0"/>
+                <w:sz w:val="18"/>
+              </w:rPr>
+              <w:t>Age, BMI, infertility diagnosis, AMH, AFC, treatment type, outcome.</w:t>
+            </w:r>
+          </w:p>
+        </w:tc>
+      </w:tr>
+      <w:tr>
+        <w:tc>
+          <w:tcPr>
+            <w:tcW w:type="dxa" w:w="1728"/>
+            <w:vAlign w:val="center"/>
+          </w:tcPr>
+          <w:p>
+            <w:pPr>
+              <w:spacing w:after="0"/>
+            </w:pPr>
+            <w:r/>
+            <w:r>
+              <w:rPr>
+                <w:rFonts w:ascii="Calibri" w:hAnsi="Calibri"/>
+                <w:b w:val="0"/>
+                <w:sz w:val="18"/>
+              </w:rPr>
+              <w:t>Recommended</w:t>
+            </w:r>
+          </w:p>
+        </w:tc>
+        <w:tc>
+          <w:tcPr>
+            <w:tcW w:type="dxa" w:w="3816"/>
+            <w:vAlign w:val="center"/>
+          </w:tcPr>
+          <w:p>
+            <w:pPr>
+              <w:spacing w:after="0"/>
+            </w:pPr>
+            <w:r/>
+            <w:r>
+              <w:rPr>
+                <w:rFonts w:ascii="Calibri" w:hAnsi="Calibri"/>
+                <w:b w:val="0"/>
+                <w:sz w:val="18"/>
+              </w:rPr>
+              <w:t>Strongly useful for personalization, model quality or explanation.</w:t>
+            </w:r>
+          </w:p>
+        </w:tc>
+        <w:tc>
+          <w:tcPr>
+            <w:tcW w:type="dxa" w:w="3528"/>
+            <w:vAlign w:val="center"/>
+          </w:tcPr>
+          <w:p>
+            <w:pPr>
+              <w:spacing w:after="0"/>
+            </w:pPr>
+            <w:r/>
+            <w:r>
+              <w:rPr>
+                <w:rFonts w:ascii="Calibri" w:hAnsi="Calibri"/>
+                <w:b w:val="0"/>
+                <w:sz w:val="18"/>
+              </w:rPr>
+              <w:t>Previous IVF attempts, gonadotropin dose, oocytes retrieved, embryo grade.</w:t>
+            </w:r>
+          </w:p>
+        </w:tc>
+      </w:tr>
+      <w:tr>
+        <w:tc>
+          <w:tcPr>
+            <w:tcW w:type="dxa" w:w="1728"/>
+            <w:vAlign w:val="center"/>
+          </w:tcPr>
+          <w:p>
+            <w:pPr>
+              <w:spacing w:after="0"/>
+            </w:pPr>
+            <w:r/>
+            <w:r>
+              <w:rPr>
+                <w:rFonts w:ascii="Calibri" w:hAnsi="Calibri"/>
+                <w:b w:val="0"/>
+                <w:sz w:val="18"/>
+              </w:rPr>
+              <w:t>Optional</w:t>
+            </w:r>
+          </w:p>
+        </w:tc>
+        <w:tc>
+          <w:tcPr>
+            <w:tcW w:type="dxa" w:w="3816"/>
+            <w:vAlign w:val="center"/>
+          </w:tcPr>
+          <w:p>
+            <w:pPr>
+              <w:spacing w:after="0"/>
+            </w:pPr>
+            <w:r/>
+            <w:r>
+              <w:rPr>
+                <w:rFonts w:ascii="Calibri" w:hAnsi="Calibri"/>
+                <w:b w:val="0"/>
+                <w:sz w:val="18"/>
+              </w:rPr>
+              <w:t>Useful if available, but not essential for the first study.</w:t>
+            </w:r>
+          </w:p>
+        </w:tc>
+        <w:tc>
+          <w:tcPr>
+            <w:tcW w:type="dxa" w:w="3528"/>
+            <w:vAlign w:val="center"/>
+          </w:tcPr>
+          <w:p>
+            <w:pPr>
+              <w:spacing w:after="0"/>
+            </w:pPr>
+            <w:r/>
+            <w:r>
+              <w:rPr>
+                <w:rFonts w:ascii="Calibri" w:hAnsi="Calibri"/>
+                <w:b w:val="0"/>
+                <w:sz w:val="18"/>
+              </w:rPr>
+              <w:t>Diet, sleep, stress, ultrasound images, PGT-A status.</w:t>
+            </w:r>
+          </w:p>
+        </w:tc>
+      </w:tr>
+      <w:tr>
+        <w:tc>
+          <w:tcPr>
+            <w:tcW w:type="dxa" w:w="1728"/>
+            <w:vAlign w:val="center"/>
+          </w:tcPr>
+          <w:p>
+            <w:pPr>
+              <w:spacing w:after="0"/>
+            </w:pPr>
+            <w:r/>
+            <w:r>
+              <w:rPr>
+                <w:rFonts w:ascii="Calibri" w:hAnsi="Calibri"/>
+                <w:b w:val="0"/>
+                <w:sz w:val="18"/>
+              </w:rPr>
+              <w:t>Sensitive</w:t>
+            </w:r>
+          </w:p>
+        </w:tc>
+        <w:tc>
+          <w:tcPr>
+            <w:tcW w:type="dxa" w:w="3816"/>
+            <w:vAlign w:val="center"/>
+          </w:tcPr>
+          <w:p>
+            <w:pPr>
+              <w:spacing w:after="0"/>
+            </w:pPr>
+            <w:r/>
+            <w:r>
+              <w:rPr>
+                <w:rFonts w:ascii="Calibri" w:hAnsi="Calibri"/>
+                <w:b w:val="0"/>
+                <w:sz w:val="18"/>
+              </w:rPr>
+              <w:t>Potentially valuable but needs stronger privacy, consent and ethics handling.</w:t>
+            </w:r>
+          </w:p>
+        </w:tc>
+        <w:tc>
+          <w:tcPr>
+            <w:tcW w:type="dxa" w:w="3528"/>
+            <w:vAlign w:val="center"/>
+          </w:tcPr>
+          <w:p>
+            <w:pPr>
+              <w:spacing w:after="0"/>
+            </w:pPr>
+            <w:r/>
+            <w:r>
+              <w:rPr>
+                <w:rFonts w:ascii="Calibri" w:hAnsi="Calibri"/>
+                <w:b w:val="0"/>
+                <w:sz w:val="18"/>
+              </w:rPr>
+              <w:t>Income, occupation, doctor ID, embryologist ID, images, genetic/ploidy data.</w:t>
+            </w:r>
+          </w:p>
+        </w:tc>
+      </w:tr>
+    </w:tbl>
+    <w:p/>
+    <w:p>
+      <w:r>
+        <w:br w:type="page"/>
       </w:r>
     </w:p>
     <w:p>
@@ -56,13 +855,14 @@
         <w:tblLook w:firstColumn="1" w:firstRow="1" w:lastColumn="0" w:lastRow="0" w:noHBand="0" w:noVBand="1" w:val="04A0"/>
       </w:tblPr>
       <w:tblGrid>
-        <w:gridCol w:w="4680"/>
-        <w:gridCol w:w="4680"/>
+        <w:gridCol w:w="3120"/>
+        <w:gridCol w:w="3120"/>
+        <w:gridCol w:w="3120"/>
       </w:tblGrid>
       <w:tr>
         <w:tc>
           <w:tcPr>
-            <w:tcW w:type="dxa" w:w="2232"/>
+            <w:tcW w:type="dxa" w:w="1800"/>
             <w:shd w:fill="F2F4F7"/>
             <w:vAlign w:val="center"/>
           </w:tcPr>
@@ -83,7 +883,7 @@
         </w:tc>
         <w:tc>
           <w:tcPr>
-            <w:tcW w:type="dxa" w:w="6912"/>
+            <w:tcW w:type="dxa" w:w="3960"/>
             <w:shd w:fill="F2F4F7"/>
             <w:vAlign w:val="center"/>
           </w:tcPr>
@@ -102,11 +902,32 @@
             </w:r>
           </w:p>
         </w:tc>
+        <w:tc>
+          <w:tcPr>
+            <w:tcW w:type="dxa" w:w="3240"/>
+            <w:shd w:fill="F2F4F7"/>
+            <w:vAlign w:val="center"/>
+          </w:tcPr>
+          <w:p>
+            <w:pPr>
+              <w:spacing w:after="0"/>
+            </w:pPr>
+            <w:r/>
+            <w:r>
+              <w:rPr>
+                <w:rFonts w:ascii="Calibri" w:hAnsi="Calibri"/>
+                <w:b/>
+                <w:sz w:val="18"/>
+              </w:rPr>
+              <w:t>Why It Matters</w:t>
+            </w:r>
+          </w:p>
+        </w:tc>
       </w:tr>
       <w:tr>
         <w:tc>
           <w:tcPr>
-            <w:tcW w:type="dxa" w:w="2232"/>
+            <w:tcW w:type="dxa" w:w="1800"/>
             <w:vAlign w:val="center"/>
           </w:tcPr>
           <w:p>
@@ -126,7 +947,7 @@
         </w:tc>
         <w:tc>
           <w:tcPr>
-            <w:tcW w:type="dxa" w:w="6912"/>
+            <w:tcW w:type="dxa" w:w="3960"/>
             <w:vAlign w:val="center"/>
           </w:tcPr>
           <w:p>
@@ -144,11 +965,31 @@
             </w:r>
           </w:p>
         </w:tc>
+        <w:tc>
+          <w:tcPr>
+            <w:tcW w:type="dxa" w:w="3240"/>
+            <w:vAlign w:val="center"/>
+          </w:tcPr>
+          <w:p>
+            <w:pPr>
+              <w:spacing w:after="0"/>
+            </w:pPr>
+            <w:r/>
+            <w:r>
+              <w:rPr>
+                <w:rFonts w:ascii="Calibri" w:hAnsi="Calibri"/>
+                <w:b w:val="0"/>
+                <w:sz w:val="18"/>
+              </w:rPr>
+              <w:t>At least one clear dependent variable is required.</w:t>
+            </w:r>
+          </w:p>
+        </w:tc>
       </w:tr>
       <w:tr>
         <w:tc>
           <w:tcPr>
-            <w:tcW w:type="dxa" w:w="2232"/>
+            <w:tcW w:type="dxa" w:w="1800"/>
             <w:vAlign w:val="center"/>
           </w:tcPr>
           <w:p>
@@ -168,7 +1009,7 @@
         </w:tc>
         <w:tc>
           <w:tcPr>
-            <w:tcW w:type="dxa" w:w="6912"/>
+            <w:tcW w:type="dxa" w:w="3960"/>
             <w:vAlign w:val="center"/>
           </w:tcPr>
           <w:p>
@@ -186,11 +1027,9 @@
             </w:r>
           </w:p>
         </w:tc>
-      </w:tr>
-      <w:tr>
         <w:tc>
           <w:tcPr>
-            <w:tcW w:type="dxa" w:w="2232"/>
+            <w:tcW w:type="dxa" w:w="3240"/>
             <w:vAlign w:val="center"/>
           </w:tcPr>
           <w:p>
@@ -204,13 +1043,35 @@
                 <w:b w:val="0"/>
                 <w:sz w:val="18"/>
               </w:rPr>
-              <w:t>Clinical</w:t>
+              <w:t>Core patient-level predictors and counselling variables.</w:t>
+            </w:r>
+          </w:p>
+        </w:tc>
+      </w:tr>
+      <w:tr>
+        <w:tc>
+          <w:tcPr>
+            <w:tcW w:type="dxa" w:w="1800"/>
+            <w:vAlign w:val="center"/>
+          </w:tcPr>
+          <w:p>
+            <w:pPr>
+              <w:spacing w:after="0"/>
+            </w:pPr>
+            <w:r/>
+            <w:r>
+              <w:rPr>
+                <w:rFonts w:ascii="Calibri" w:hAnsi="Calibri"/>
+                <w:b w:val="0"/>
+                <w:sz w:val="18"/>
+              </w:rPr>
+              <w:t>Clinical/hormonal</w:t>
             </w:r>
           </w:p>
         </w:tc>
         <w:tc>
           <w:tcPr>
-            <w:tcW w:type="dxa" w:w="6912"/>
+            <w:tcW w:type="dxa" w:w="3960"/>
             <w:vAlign w:val="center"/>
           </w:tcPr>
           <w:p>
@@ -228,11 +1089,31 @@
             </w:r>
           </w:p>
         </w:tc>
+        <w:tc>
+          <w:tcPr>
+            <w:tcW w:type="dxa" w:w="3240"/>
+            <w:vAlign w:val="center"/>
+          </w:tcPr>
+          <w:p>
+            <w:pPr>
+              <w:spacing w:after="0"/>
+            </w:pPr>
+            <w:r/>
+            <w:r>
+              <w:rPr>
+                <w:rFonts w:ascii="Calibri" w:hAnsi="Calibri"/>
+                <w:b w:val="0"/>
+                <w:sz w:val="18"/>
+              </w:rPr>
+              <w:t>Represents ovarian reserve and major clinical subgroups.</w:t>
+            </w:r>
+          </w:p>
+        </w:tc>
       </w:tr>
       <w:tr>
         <w:tc>
           <w:tcPr>
-            <w:tcW w:type="dxa" w:w="2232"/>
+            <w:tcW w:type="dxa" w:w="1800"/>
             <w:vAlign w:val="center"/>
           </w:tcPr>
           <w:p>
@@ -252,7 +1133,7 @@
         </w:tc>
         <w:tc>
           <w:tcPr>
-            <w:tcW w:type="dxa" w:w="6912"/>
+            <w:tcW w:type="dxa" w:w="3960"/>
             <w:vAlign w:val="center"/>
           </w:tcPr>
           <w:p>
@@ -270,11 +1151,31 @@
             </w:r>
           </w:p>
         </w:tc>
+        <w:tc>
+          <w:tcPr>
+            <w:tcW w:type="dxa" w:w="3240"/>
+            <w:vAlign w:val="center"/>
+          </w:tcPr>
+          <w:p>
+            <w:pPr>
+              <w:spacing w:after="0"/>
+            </w:pPr>
+            <w:r/>
+            <w:r>
+              <w:rPr>
+                <w:rFonts w:ascii="Calibri" w:hAnsi="Calibri"/>
+                <w:b w:val="0"/>
+                <w:sz w:val="18"/>
+              </w:rPr>
+              <w:t>Captures treatment pathway and transfer context.</w:t>
+            </w:r>
+          </w:p>
+        </w:tc>
       </w:tr>
       <w:tr>
         <w:tc>
           <w:tcPr>
-            <w:tcW w:type="dxa" w:w="2232"/>
+            <w:tcW w:type="dxa" w:w="1800"/>
             <w:vAlign w:val="center"/>
           </w:tcPr>
           <w:p>
@@ -294,7 +1195,7 @@
         </w:tc>
         <w:tc>
           <w:tcPr>
-            <w:tcW w:type="dxa" w:w="6912"/>
+            <w:tcW w:type="dxa" w:w="3960"/>
             <w:vAlign w:val="center"/>
           </w:tcPr>
           <w:p>
@@ -308,7 +1209,27 @@
                 <w:b w:val="0"/>
                 <w:sz w:val="18"/>
               </w:rPr>
-              <w:t>At least train/test or temporal split; external validation only if independent data exists.</w:t>
+              <w:t>Train/test, cross-validation or temporal split.</w:t>
+            </w:r>
+          </w:p>
+        </w:tc>
+        <w:tc>
+          <w:tcPr>
+            <w:tcW w:type="dxa" w:w="3240"/>
+            <w:vAlign w:val="center"/>
+          </w:tcPr>
+          <w:p>
+            <w:pPr>
+              <w:spacing w:after="0"/>
+            </w:pPr>
+            <w:r/>
+            <w:r>
+              <w:rPr>
+                <w:rFonts w:ascii="Calibri" w:hAnsi="Calibri"/>
+                <w:b w:val="0"/>
+                <w:sz w:val="18"/>
+              </w:rPr>
+              <w:t>External validation only if independent data exists.</w:t>
             </w:r>
           </w:p>
         </w:tc>
@@ -323,30 +1244,333 @@
         <w:t>Strong Dataset Scenario</w:t>
       </w:r>
     </w:p>
-    <w:p>
-      <w:pPr>
-        <w:pStyle w:val="ListBullet"/>
-      </w:pPr>
-      <w:r>
-        <w:t>Clinical variables plus embryology variables such as oocytes retrieved, mature oocytes, fertilization rate, embryo grade, blastocyst grade and transfer day.</w:t>
-      </w:r>
-    </w:p>
-    <w:p>
-      <w:pPr>
-        <w:pStyle w:val="ListBullet"/>
-      </w:pPr>
-      <w:r>
-        <w:t>Allows the title to include multimodal clinical and embryological data.</w:t>
-      </w:r>
-    </w:p>
-    <w:p>
-      <w:pPr>
-        <w:pStyle w:val="ListBullet"/>
-      </w:pPr>
-      <w:r>
-        <w:t>Supports stronger personalization and explanation outputs than clinical data alone.</w:t>
-      </w:r>
-    </w:p>
+    <w:tbl>
+      <w:tblPr>
+        <w:tblStyle w:val="TableGrid"/>
+        <w:tblW w:type="auto" w:w="0"/>
+        <w:jc w:val="center"/>
+        <w:tblLook w:firstColumn="1" w:firstRow="1" w:lastColumn="0" w:lastRow="0" w:noHBand="0" w:noVBand="1" w:val="04A0"/>
+      </w:tblPr>
+      <w:tblGrid>
+        <w:gridCol w:w="3120"/>
+        <w:gridCol w:w="3120"/>
+        <w:gridCol w:w="3120"/>
+      </w:tblGrid>
+      <w:tr>
+        <w:tc>
+          <w:tcPr>
+            <w:tcW w:type="dxa" w:w="1872"/>
+            <w:shd w:fill="F2F4F7"/>
+            <w:vAlign w:val="center"/>
+          </w:tcPr>
+          <w:p>
+            <w:pPr>
+              <w:spacing w:after="0"/>
+            </w:pPr>
+            <w:r/>
+            <w:r>
+              <w:rPr>
+                <w:rFonts w:ascii="Calibri" w:hAnsi="Calibri"/>
+                <w:b/>
+                <w:sz w:val="18"/>
+              </w:rPr>
+              <w:t>Data Group</w:t>
+            </w:r>
+          </w:p>
+        </w:tc>
+        <w:tc>
+          <w:tcPr>
+            <w:tcW w:type="dxa" w:w="4320"/>
+            <w:shd w:fill="F2F4F7"/>
+            <w:vAlign w:val="center"/>
+          </w:tcPr>
+          <w:p>
+            <w:pPr>
+              <w:spacing w:after="0"/>
+            </w:pPr>
+            <w:r/>
+            <w:r>
+              <w:rPr>
+                <w:rFonts w:ascii="Calibri" w:hAnsi="Calibri"/>
+                <w:b/>
+                <w:sz w:val="18"/>
+              </w:rPr>
+              <w:t>Useful Variables</w:t>
+            </w:r>
+          </w:p>
+        </w:tc>
+        <w:tc>
+          <w:tcPr>
+            <w:tcW w:type="dxa" w:w="2880"/>
+            <w:shd w:fill="F2F4F7"/>
+            <w:vAlign w:val="center"/>
+          </w:tcPr>
+          <w:p>
+            <w:pPr>
+              <w:spacing w:after="0"/>
+            </w:pPr>
+            <w:r/>
+            <w:r>
+              <w:rPr>
+                <w:rFonts w:ascii="Calibri" w:hAnsi="Calibri"/>
+                <w:b/>
+                <w:sz w:val="18"/>
+              </w:rPr>
+              <w:t>Topic Benefit</w:t>
+            </w:r>
+          </w:p>
+        </w:tc>
+      </w:tr>
+      <w:tr>
+        <w:tc>
+          <w:tcPr>
+            <w:tcW w:type="dxa" w:w="1872"/>
+            <w:vAlign w:val="center"/>
+          </w:tcPr>
+          <w:p>
+            <w:pPr>
+              <w:spacing w:after="0"/>
+            </w:pPr>
+            <w:r/>
+            <w:r>
+              <w:rPr>
+                <w:rFonts w:ascii="Calibri" w:hAnsi="Calibri"/>
+                <w:b w:val="0"/>
+                <w:sz w:val="18"/>
+              </w:rPr>
+              <w:t>Embryology</w:t>
+            </w:r>
+          </w:p>
+        </w:tc>
+        <w:tc>
+          <w:tcPr>
+            <w:tcW w:type="dxa" w:w="4320"/>
+            <w:vAlign w:val="center"/>
+          </w:tcPr>
+          <w:p>
+            <w:pPr>
+              <w:spacing w:after="0"/>
+            </w:pPr>
+            <w:r/>
+            <w:r>
+              <w:rPr>
+                <w:rFonts w:ascii="Calibri" w:hAnsi="Calibri"/>
+                <w:b w:val="0"/>
+                <w:sz w:val="18"/>
+              </w:rPr>
+              <w:t>Oocytes retrieved, mature oocytes, fertilization rate, embryo grade, blastocyst grade, transfer day.</w:t>
+            </w:r>
+          </w:p>
+        </w:tc>
+        <w:tc>
+          <w:tcPr>
+            <w:tcW w:type="dxa" w:w="2880"/>
+            <w:vAlign w:val="center"/>
+          </w:tcPr>
+          <w:p>
+            <w:pPr>
+              <w:spacing w:after="0"/>
+            </w:pPr>
+            <w:r/>
+            <w:r>
+              <w:rPr>
+                <w:rFonts w:ascii="Calibri" w:hAnsi="Calibri"/>
+                <w:b w:val="0"/>
+                <w:sz w:val="18"/>
+              </w:rPr>
+              <w:t>Allows multimodal clinical-embryological prediction.</w:t>
+            </w:r>
+          </w:p>
+        </w:tc>
+      </w:tr>
+      <w:tr>
+        <w:tc>
+          <w:tcPr>
+            <w:tcW w:type="dxa" w:w="1872"/>
+            <w:vAlign w:val="center"/>
+          </w:tcPr>
+          <w:p>
+            <w:pPr>
+              <w:spacing w:after="0"/>
+            </w:pPr>
+            <w:r/>
+            <w:r>
+              <w:rPr>
+                <w:rFonts w:ascii="Calibri" w:hAnsi="Calibri"/>
+                <w:b w:val="0"/>
+                <w:sz w:val="18"/>
+              </w:rPr>
+              <w:t>Treatment intensity</w:t>
+            </w:r>
+          </w:p>
+        </w:tc>
+        <w:tc>
+          <w:tcPr>
+            <w:tcW w:type="dxa" w:w="4320"/>
+            <w:vAlign w:val="center"/>
+          </w:tcPr>
+          <w:p>
+            <w:pPr>
+              <w:spacing w:after="0"/>
+            </w:pPr>
+            <w:r/>
+            <w:r>
+              <w:rPr>
+                <w:rFonts w:ascii="Calibri" w:hAnsi="Calibri"/>
+                <w:b w:val="0"/>
+                <w:sz w:val="18"/>
+              </w:rPr>
+              <w:t>Starting dose, total gonadotropin dose, stimulation duration, trigger type/day.</w:t>
+            </w:r>
+          </w:p>
+        </w:tc>
+        <w:tc>
+          <w:tcPr>
+            <w:tcW w:type="dxa" w:w="2880"/>
+            <w:vAlign w:val="center"/>
+          </w:tcPr>
+          <w:p>
+            <w:pPr>
+              <w:spacing w:after="0"/>
+            </w:pPr>
+            <w:r/>
+            <w:r>
+              <w:rPr>
+                <w:rFonts w:ascii="Calibri" w:hAnsi="Calibri"/>
+                <w:b w:val="0"/>
+                <w:sz w:val="18"/>
+              </w:rPr>
+              <w:t>Supports personalization and possible stimulation-response analysis.</w:t>
+            </w:r>
+          </w:p>
+        </w:tc>
+      </w:tr>
+      <w:tr>
+        <w:tc>
+          <w:tcPr>
+            <w:tcW w:type="dxa" w:w="1872"/>
+            <w:vAlign w:val="center"/>
+          </w:tcPr>
+          <w:p>
+            <w:pPr>
+              <w:spacing w:after="0"/>
+            </w:pPr>
+            <w:r/>
+            <w:r>
+              <w:rPr>
+                <w:rFonts w:ascii="Calibri" w:hAnsi="Calibri"/>
+                <w:b w:val="0"/>
+                <w:sz w:val="18"/>
+              </w:rPr>
+              <w:t>Male partner</w:t>
+            </w:r>
+          </w:p>
+        </w:tc>
+        <w:tc>
+          <w:tcPr>
+            <w:tcW w:type="dxa" w:w="4320"/>
+            <w:vAlign w:val="center"/>
+          </w:tcPr>
+          <w:p>
+            <w:pPr>
+              <w:spacing w:after="0"/>
+            </w:pPr>
+            <w:r/>
+            <w:r>
+              <w:rPr>
+                <w:rFonts w:ascii="Calibri" w:hAnsi="Calibri"/>
+                <w:b w:val="0"/>
+                <w:sz w:val="18"/>
+              </w:rPr>
+              <w:t>Sperm count/concentration, motility, morphology, male-factor diagnosis.</w:t>
+            </w:r>
+          </w:p>
+        </w:tc>
+        <w:tc>
+          <w:tcPr>
+            <w:tcW w:type="dxa" w:w="2880"/>
+            <w:vAlign w:val="center"/>
+          </w:tcPr>
+          <w:p>
+            <w:pPr>
+              <w:spacing w:after="0"/>
+            </w:pPr>
+            <w:r/>
+            <w:r>
+              <w:rPr>
+                <w:rFonts w:ascii="Calibri" w:hAnsi="Calibri"/>
+                <w:b w:val="0"/>
+                <w:sz w:val="18"/>
+              </w:rPr>
+              <w:t>Improves couple-level IVF context if available.</w:t>
+            </w:r>
+          </w:p>
+        </w:tc>
+      </w:tr>
+      <w:tr>
+        <w:tc>
+          <w:tcPr>
+            <w:tcW w:type="dxa" w:w="1872"/>
+            <w:vAlign w:val="center"/>
+          </w:tcPr>
+          <w:p>
+            <w:pPr>
+              <w:spacing w:after="0"/>
+            </w:pPr>
+            <w:r/>
+            <w:r>
+              <w:rPr>
+                <w:rFonts w:ascii="Calibri" w:hAnsi="Calibri"/>
+                <w:b w:val="0"/>
+                <w:sz w:val="18"/>
+              </w:rPr>
+              <w:t>Time/workflow</w:t>
+            </w:r>
+          </w:p>
+        </w:tc>
+        <w:tc>
+          <w:tcPr>
+            <w:tcW w:type="dxa" w:w="4320"/>
+            <w:vAlign w:val="center"/>
+          </w:tcPr>
+          <w:p>
+            <w:pPr>
+              <w:spacing w:after="0"/>
+            </w:pPr>
+            <w:r/>
+            <w:r>
+              <w:rPr>
+                <w:rFonts w:ascii="Calibri" w:hAnsi="Calibri"/>
+                <w:b w:val="0"/>
+                <w:sz w:val="18"/>
+              </w:rPr>
+              <w:t>Treatment year, protocol changes, clinic ID if available.</w:t>
+            </w:r>
+          </w:p>
+        </w:tc>
+        <w:tc>
+          <w:tcPr>
+            <w:tcW w:type="dxa" w:w="2880"/>
+            <w:vAlign w:val="center"/>
+          </w:tcPr>
+          <w:p>
+            <w:pPr>
+              <w:spacing w:after="0"/>
+            </w:pPr>
+            <w:r/>
+            <w:r>
+              <w:rPr>
+                <w:rFonts w:ascii="Calibri" w:hAnsi="Calibri"/>
+                <w:b w:val="0"/>
+                <w:sz w:val="18"/>
+              </w:rPr>
+              <w:t>Supports temporal or clinic-wise validation and model drift discussion.</w:t>
+            </w:r>
+          </w:p>
+        </w:tc>
+      </w:tr>
+    </w:tbl>
+    <w:p/>
     <w:p>
       <w:pPr>
         <w:pStyle w:val="Heading1"/>
@@ -355,12 +1579,1193 @@
         <w:t>Ideal Dataset Scenario</w:t>
       </w:r>
     </w:p>
+    <w:tbl>
+      <w:tblPr>
+        <w:tblStyle w:val="TableGrid"/>
+        <w:tblW w:type="auto" w:w="0"/>
+        <w:jc w:val="center"/>
+        <w:tblLook w:firstColumn="1" w:firstRow="1" w:lastColumn="0" w:lastRow="0" w:noHBand="0" w:noVBand="1" w:val="04A0"/>
+      </w:tblPr>
+      <w:tblGrid>
+        <w:gridCol w:w="3120"/>
+        <w:gridCol w:w="3120"/>
+        <w:gridCol w:w="3120"/>
+      </w:tblGrid>
+      <w:tr>
+        <w:tc>
+          <w:tcPr>
+            <w:tcW w:type="dxa" w:w="2448"/>
+            <w:shd w:fill="F2F4F7"/>
+            <w:vAlign w:val="center"/>
+          </w:tcPr>
+          <w:p>
+            <w:pPr>
+              <w:spacing w:after="0"/>
+            </w:pPr>
+            <w:r/>
+            <w:r>
+              <w:rPr>
+                <w:rFonts w:ascii="Calibri" w:hAnsi="Calibri"/>
+                <w:b/>
+                <w:sz w:val="18"/>
+              </w:rPr>
+              <w:t>Ideal Addition</w:t>
+            </w:r>
+          </w:p>
+        </w:tc>
+        <w:tc>
+          <w:tcPr>
+            <w:tcW w:type="dxa" w:w="3672"/>
+            <w:shd w:fill="F2F4F7"/>
+            <w:vAlign w:val="center"/>
+          </w:tcPr>
+          <w:p>
+            <w:pPr>
+              <w:spacing w:after="0"/>
+            </w:pPr>
+            <w:r/>
+            <w:r>
+              <w:rPr>
+                <w:rFonts w:ascii="Calibri" w:hAnsi="Calibri"/>
+                <w:b/>
+                <w:sz w:val="18"/>
+              </w:rPr>
+              <w:t>Use</w:t>
+            </w:r>
+          </w:p>
+        </w:tc>
+        <w:tc>
+          <w:tcPr>
+            <w:tcW w:type="dxa" w:w="2952"/>
+            <w:shd w:fill="F2F4F7"/>
+            <w:vAlign w:val="center"/>
+          </w:tcPr>
+          <w:p>
+            <w:pPr>
+              <w:spacing w:after="0"/>
+            </w:pPr>
+            <w:r/>
+            <w:r>
+              <w:rPr>
+                <w:rFonts w:ascii="Calibri" w:hAnsi="Calibri"/>
+                <w:b/>
+                <w:sz w:val="18"/>
+              </w:rPr>
+              <w:t>Caution</w:t>
+            </w:r>
+          </w:p>
+        </w:tc>
+      </w:tr>
+      <w:tr>
+        <w:tc>
+          <w:tcPr>
+            <w:tcW w:type="dxa" w:w="2448"/>
+            <w:vAlign w:val="center"/>
+          </w:tcPr>
+          <w:p>
+            <w:pPr>
+              <w:spacing w:after="0"/>
+            </w:pPr>
+            <w:r/>
+            <w:r>
+              <w:rPr>
+                <w:rFonts w:ascii="Calibri" w:hAnsi="Calibri"/>
+                <w:b w:val="0"/>
+                <w:sz w:val="18"/>
+              </w:rPr>
+              <w:t>Lifestyle questionnaire</w:t>
+            </w:r>
+          </w:p>
+        </w:tc>
+        <w:tc>
+          <w:tcPr>
+            <w:tcW w:type="dxa" w:w="3672"/>
+            <w:vAlign w:val="center"/>
+          </w:tcPr>
+          <w:p>
+            <w:pPr>
+              <w:spacing w:after="0"/>
+            </w:pPr>
+            <w:r/>
+            <w:r>
+              <w:rPr>
+                <w:rFonts w:ascii="Calibri" w:hAnsi="Calibri"/>
+                <w:b w:val="0"/>
+                <w:sz w:val="18"/>
+              </w:rPr>
+              <w:t>Smoking, physical activity, sleep, stress, diet, caffeine or occupation.</w:t>
+            </w:r>
+          </w:p>
+        </w:tc>
+        <w:tc>
+          <w:tcPr>
+            <w:tcW w:type="dxa" w:w="2952"/>
+            <w:vAlign w:val="center"/>
+          </w:tcPr>
+          <w:p>
+            <w:pPr>
+              <w:spacing w:after="0"/>
+            </w:pPr>
+            <w:r/>
+            <w:r>
+              <w:rPr>
+                <w:rFonts w:ascii="Calibri" w:hAnsi="Calibri"/>
+                <w:b w:val="0"/>
+                <w:sz w:val="18"/>
+              </w:rPr>
+              <w:t>Use validated or clearly defined measures; avoid weak self-report claims.</w:t>
+            </w:r>
+          </w:p>
+        </w:tc>
+      </w:tr>
+      <w:tr>
+        <w:tc>
+          <w:tcPr>
+            <w:tcW w:type="dxa" w:w="2448"/>
+            <w:vAlign w:val="center"/>
+          </w:tcPr>
+          <w:p>
+            <w:pPr>
+              <w:spacing w:after="0"/>
+            </w:pPr>
+            <w:r/>
+            <w:r>
+              <w:rPr>
+                <w:rFonts w:ascii="Calibri" w:hAnsi="Calibri"/>
+                <w:b w:val="0"/>
+                <w:sz w:val="18"/>
+              </w:rPr>
+              <w:t>Multiple clinics or independent time period</w:t>
+            </w:r>
+          </w:p>
+        </w:tc>
+        <w:tc>
+          <w:tcPr>
+            <w:tcW w:type="dxa" w:w="3672"/>
+            <w:vAlign w:val="center"/>
+          </w:tcPr>
+          <w:p>
+            <w:pPr>
+              <w:spacing w:after="0"/>
+            </w:pPr>
+            <w:r/>
+            <w:r>
+              <w:rPr>
+                <w:rFonts w:ascii="Calibri" w:hAnsi="Calibri"/>
+                <w:b w:val="0"/>
+                <w:sz w:val="18"/>
+              </w:rPr>
+              <w:t>External, clinic-wise or temporal validation.</w:t>
+            </w:r>
+          </w:p>
+        </w:tc>
+        <w:tc>
+          <w:tcPr>
+            <w:tcW w:type="dxa" w:w="2952"/>
+            <w:vAlign w:val="center"/>
+          </w:tcPr>
+          <w:p>
+            <w:pPr>
+              <w:spacing w:after="0"/>
+            </w:pPr>
+            <w:r/>
+            <w:r>
+              <w:rPr>
+                <w:rFonts w:ascii="Calibri" w:hAnsi="Calibri"/>
+                <w:b w:val="0"/>
+                <w:sz w:val="18"/>
+              </w:rPr>
+              <w:t>Do not call internal testing external validation.</w:t>
+            </w:r>
+          </w:p>
+        </w:tc>
+      </w:tr>
+      <w:tr>
+        <w:tc>
+          <w:tcPr>
+            <w:tcW w:type="dxa" w:w="2448"/>
+            <w:vAlign w:val="center"/>
+          </w:tcPr>
+          <w:p>
+            <w:pPr>
+              <w:spacing w:after="0"/>
+            </w:pPr>
+            <w:r/>
+            <w:r>
+              <w:rPr>
+                <w:rFonts w:ascii="Calibri" w:hAnsi="Calibri"/>
+                <w:b w:val="0"/>
+                <w:sz w:val="18"/>
+              </w:rPr>
+              <w:t>Clinician review</w:t>
+            </w:r>
+          </w:p>
+        </w:tc>
+        <w:tc>
+          <w:tcPr>
+            <w:tcW w:type="dxa" w:w="3672"/>
+            <w:vAlign w:val="center"/>
+          </w:tcPr>
+          <w:p>
+            <w:pPr>
+              <w:spacing w:after="0"/>
+            </w:pPr>
+            <w:r/>
+            <w:r>
+              <w:rPr>
+                <w:rFonts w:ascii="Calibri" w:hAnsi="Calibri"/>
+                <w:b w:val="0"/>
+                <w:sz w:val="18"/>
+              </w:rPr>
+              <w:t>Checks whether explanation outputs are meaningful for counselling.</w:t>
+            </w:r>
+          </w:p>
+        </w:tc>
+        <w:tc>
+          <w:tcPr>
+            <w:tcW w:type="dxa" w:w="2952"/>
+            <w:vAlign w:val="center"/>
+          </w:tcPr>
+          <w:p>
+            <w:pPr>
+              <w:spacing w:after="0"/>
+            </w:pPr>
+            <w:r/>
+            <w:r>
+              <w:rPr>
+                <w:rFonts w:ascii="Calibri" w:hAnsi="Calibri"/>
+                <w:b w:val="0"/>
+                <w:sz w:val="18"/>
+              </w:rPr>
+              <w:t>This evaluates usefulness, not clinical outcome improvement.</w:t>
+            </w:r>
+          </w:p>
+        </w:tc>
+      </w:tr>
+      <w:tr>
+        <w:tc>
+          <w:tcPr>
+            <w:tcW w:type="dxa" w:w="2448"/>
+            <w:vAlign w:val="center"/>
+          </w:tcPr>
+          <w:p>
+            <w:pPr>
+              <w:spacing w:after="0"/>
+            </w:pPr>
+            <w:r/>
+            <w:r>
+              <w:rPr>
+                <w:rFonts w:ascii="Calibri" w:hAnsi="Calibri"/>
+                <w:b w:val="0"/>
+                <w:sz w:val="18"/>
+              </w:rPr>
+              <w:t>Images/time-lapse/radiomics</w:t>
+            </w:r>
+          </w:p>
+        </w:tc>
+        <w:tc>
+          <w:tcPr>
+            <w:tcW w:type="dxa" w:w="3672"/>
+            <w:vAlign w:val="center"/>
+          </w:tcPr>
+          <w:p>
+            <w:pPr>
+              <w:spacing w:after="0"/>
+            </w:pPr>
+            <w:r/>
+            <w:r>
+              <w:rPr>
+                <w:rFonts w:ascii="Calibri" w:hAnsi="Calibri"/>
+                <w:b w:val="0"/>
+                <w:sz w:val="18"/>
+              </w:rPr>
+              <w:t>Possible deep learning or radiomics direction.</w:t>
+            </w:r>
+          </w:p>
+        </w:tc>
+        <w:tc>
+          <w:tcPr>
+            <w:tcW w:type="dxa" w:w="2952"/>
+            <w:vAlign w:val="center"/>
+          </w:tcPr>
+          <w:p>
+            <w:pPr>
+              <w:spacing w:after="0"/>
+            </w:pPr>
+            <w:r/>
+            <w:r>
+              <w:rPr>
+                <w:rFonts w:ascii="Calibri" w:hAnsi="Calibri"/>
+                <w:b w:val="0"/>
+                <w:sz w:val="18"/>
+              </w:rPr>
+              <w:t>Only feasible with storage, consent, annotation and technical support.</w:t>
+            </w:r>
+          </w:p>
+        </w:tc>
+      </w:tr>
+    </w:tbl>
+    <w:p/>
     <w:p>
       <w:pPr>
-        <w:pStyle w:val="ListBullet"/>
+        <w:pStyle w:val="Heading1"/>
       </w:pPr>
       <w:r>
-        <w:t>Clinical, treatment, embryology and lifestyle variables collected consistently.</w:t>
+        <w:t>Outcome Selection</w:t>
+      </w:r>
+    </w:p>
+    <w:tbl>
+      <w:tblPr>
+        <w:tblStyle w:val="TableGrid"/>
+        <w:tblW w:type="auto" w:w="0"/>
+        <w:jc w:val="center"/>
+        <w:tblLook w:firstColumn="1" w:firstRow="1" w:lastColumn="0" w:lastRow="0" w:noHBand="0" w:noVBand="1" w:val="04A0"/>
+      </w:tblPr>
+      <w:tblGrid>
+        <w:gridCol w:w="2340"/>
+        <w:gridCol w:w="2340"/>
+        <w:gridCol w:w="2340"/>
+        <w:gridCol w:w="2340"/>
+      </w:tblGrid>
+      <w:tr>
+        <w:tc>
+          <w:tcPr>
+            <w:tcW w:type="dxa" w:w="1872"/>
+            <w:shd w:fill="F2F4F7"/>
+            <w:vAlign w:val="center"/>
+          </w:tcPr>
+          <w:p>
+            <w:pPr>
+              <w:spacing w:after="0"/>
+            </w:pPr>
+            <w:r/>
+            <w:r>
+              <w:rPr>
+                <w:rFonts w:ascii="Calibri" w:hAnsi="Calibri"/>
+                <w:b/>
+                <w:sz w:val="18"/>
+              </w:rPr>
+              <w:t>Outcome</w:t>
+            </w:r>
+          </w:p>
+        </w:tc>
+        <w:tc>
+          <w:tcPr>
+            <w:tcW w:type="dxa" w:w="1800"/>
+            <w:shd w:fill="F2F4F7"/>
+            <w:vAlign w:val="center"/>
+          </w:tcPr>
+          <w:p>
+            <w:pPr>
+              <w:spacing w:after="0"/>
+            </w:pPr>
+            <w:r/>
+            <w:r>
+              <w:rPr>
+                <w:rFonts w:ascii="Calibri" w:hAnsi="Calibri"/>
+                <w:b/>
+                <w:sz w:val="18"/>
+              </w:rPr>
+              <w:t>Priority</w:t>
+            </w:r>
+          </w:p>
+        </w:tc>
+        <w:tc>
+          <w:tcPr>
+            <w:tcW w:type="dxa" w:w="3312"/>
+            <w:shd w:fill="F2F4F7"/>
+            <w:vAlign w:val="center"/>
+          </w:tcPr>
+          <w:p>
+            <w:pPr>
+              <w:spacing w:after="0"/>
+            </w:pPr>
+            <w:r/>
+            <w:r>
+              <w:rPr>
+                <w:rFonts w:ascii="Calibri" w:hAnsi="Calibri"/>
+                <w:b/>
+                <w:sz w:val="18"/>
+              </w:rPr>
+              <w:t>Use In Study</w:t>
+            </w:r>
+          </w:p>
+        </w:tc>
+        <w:tc>
+          <w:tcPr>
+            <w:tcW w:type="dxa" w:w="2160"/>
+            <w:shd w:fill="F2F4F7"/>
+            <w:vAlign w:val="center"/>
+          </w:tcPr>
+          <w:p>
+            <w:pPr>
+              <w:spacing w:after="0"/>
+            </w:pPr>
+            <w:r/>
+            <w:r>
+              <w:rPr>
+                <w:rFonts w:ascii="Calibri" w:hAnsi="Calibri"/>
+                <w:b/>
+                <w:sz w:val="18"/>
+              </w:rPr>
+              <w:t>Caution</w:t>
+            </w:r>
+          </w:p>
+        </w:tc>
+      </w:tr>
+      <w:tr>
+        <w:tc>
+          <w:tcPr>
+            <w:tcW w:type="dxa" w:w="1872"/>
+            <w:vAlign w:val="center"/>
+          </w:tcPr>
+          <w:p>
+            <w:pPr>
+              <w:spacing w:after="0"/>
+            </w:pPr>
+            <w:r/>
+            <w:r>
+              <w:rPr>
+                <w:rFonts w:ascii="Calibri" w:hAnsi="Calibri"/>
+                <w:b w:val="0"/>
+                <w:sz w:val="18"/>
+              </w:rPr>
+              <w:t>Live birth</w:t>
+            </w:r>
+          </w:p>
+        </w:tc>
+        <w:tc>
+          <w:tcPr>
+            <w:tcW w:type="dxa" w:w="1800"/>
+            <w:vAlign w:val="center"/>
+          </w:tcPr>
+          <w:p>
+            <w:pPr>
+              <w:spacing w:after="0"/>
+            </w:pPr>
+            <w:r/>
+            <w:r>
+              <w:rPr>
+                <w:rFonts w:ascii="Calibri" w:hAnsi="Calibri"/>
+                <w:b w:val="0"/>
+                <w:sz w:val="18"/>
+              </w:rPr>
+              <w:t>Preferred if available</w:t>
+            </w:r>
+          </w:p>
+        </w:tc>
+        <w:tc>
+          <w:tcPr>
+            <w:tcW w:type="dxa" w:w="3312"/>
+            <w:vAlign w:val="center"/>
+          </w:tcPr>
+          <w:p>
+            <w:pPr>
+              <w:spacing w:after="0"/>
+            </w:pPr>
+            <w:r/>
+            <w:r>
+              <w:rPr>
+                <w:rFonts w:ascii="Calibri" w:hAnsi="Calibri"/>
+                <w:b w:val="0"/>
+                <w:sz w:val="18"/>
+              </w:rPr>
+              <w:t>Strongest patient-relevant IVF endpoint.</w:t>
+            </w:r>
+          </w:p>
+        </w:tc>
+        <w:tc>
+          <w:tcPr>
+            <w:tcW w:type="dxa" w:w="2160"/>
+            <w:vAlign w:val="center"/>
+          </w:tcPr>
+          <w:p>
+            <w:pPr>
+              <w:spacing w:after="0"/>
+            </w:pPr>
+            <w:r/>
+            <w:r>
+              <w:rPr>
+                <w:rFonts w:ascii="Calibri" w:hAnsi="Calibri"/>
+                <w:b w:val="0"/>
+                <w:sz w:val="18"/>
+              </w:rPr>
+              <w:t>May require follow-up and complete records.</w:t>
+            </w:r>
+          </w:p>
+        </w:tc>
+      </w:tr>
+      <w:tr>
+        <w:tc>
+          <w:tcPr>
+            <w:tcW w:type="dxa" w:w="1872"/>
+            <w:vAlign w:val="center"/>
+          </w:tcPr>
+          <w:p>
+            <w:pPr>
+              <w:spacing w:after="0"/>
+            </w:pPr>
+            <w:r/>
+            <w:r>
+              <w:rPr>
+                <w:rFonts w:ascii="Calibri" w:hAnsi="Calibri"/>
+                <w:b w:val="0"/>
+                <w:sz w:val="18"/>
+              </w:rPr>
+              <w:t>Clinical pregnancy</w:t>
+            </w:r>
+          </w:p>
+        </w:tc>
+        <w:tc>
+          <w:tcPr>
+            <w:tcW w:type="dxa" w:w="1800"/>
+            <w:vAlign w:val="center"/>
+          </w:tcPr>
+          <w:p>
+            <w:pPr>
+              <w:spacing w:after="0"/>
+            </w:pPr>
+            <w:r/>
+            <w:r>
+              <w:rPr>
+                <w:rFonts w:ascii="Calibri" w:hAnsi="Calibri"/>
+                <w:b w:val="0"/>
+                <w:sz w:val="18"/>
+              </w:rPr>
+              <w:t>Minimum acceptable</w:t>
+            </w:r>
+          </w:p>
+        </w:tc>
+        <w:tc>
+          <w:tcPr>
+            <w:tcW w:type="dxa" w:w="3312"/>
+            <w:vAlign w:val="center"/>
+          </w:tcPr>
+          <w:p>
+            <w:pPr>
+              <w:spacing w:after="0"/>
+            </w:pPr>
+            <w:r/>
+            <w:r>
+              <w:rPr>
+                <w:rFonts w:ascii="Calibri" w:hAnsi="Calibri"/>
+                <w:b w:val="0"/>
+                <w:sz w:val="18"/>
+              </w:rPr>
+              <w:t>Often easier to obtain and still clinically meaningful.</w:t>
+            </w:r>
+          </w:p>
+        </w:tc>
+        <w:tc>
+          <w:tcPr>
+            <w:tcW w:type="dxa" w:w="2160"/>
+            <w:vAlign w:val="center"/>
+          </w:tcPr>
+          <w:p>
+            <w:pPr>
+              <w:spacing w:after="0"/>
+            </w:pPr>
+            <w:r/>
+            <w:r>
+              <w:rPr>
+                <w:rFonts w:ascii="Calibri" w:hAnsi="Calibri"/>
+                <w:b w:val="0"/>
+                <w:sz w:val="18"/>
+              </w:rPr>
+              <w:t>Less final than live birth.</w:t>
+            </w:r>
+          </w:p>
+        </w:tc>
+      </w:tr>
+      <w:tr>
+        <w:tc>
+          <w:tcPr>
+            <w:tcW w:type="dxa" w:w="1872"/>
+            <w:vAlign w:val="center"/>
+          </w:tcPr>
+          <w:p>
+            <w:pPr>
+              <w:spacing w:after="0"/>
+            </w:pPr>
+            <w:r/>
+            <w:r>
+              <w:rPr>
+                <w:rFonts w:ascii="Calibri" w:hAnsi="Calibri"/>
+                <w:b w:val="0"/>
+                <w:sz w:val="18"/>
+              </w:rPr>
+              <w:t>Miscarriage</w:t>
+            </w:r>
+          </w:p>
+        </w:tc>
+        <w:tc>
+          <w:tcPr>
+            <w:tcW w:type="dxa" w:w="1800"/>
+            <w:vAlign w:val="center"/>
+          </w:tcPr>
+          <w:p>
+            <w:pPr>
+              <w:spacing w:after="0"/>
+            </w:pPr>
+            <w:r/>
+            <w:r>
+              <w:rPr>
+                <w:rFonts w:ascii="Calibri" w:hAnsi="Calibri"/>
+                <w:b w:val="0"/>
+                <w:sz w:val="18"/>
+              </w:rPr>
+              <w:t>Secondary</w:t>
+            </w:r>
+          </w:p>
+        </w:tc>
+        <w:tc>
+          <w:tcPr>
+            <w:tcW w:type="dxa" w:w="3312"/>
+            <w:vAlign w:val="center"/>
+          </w:tcPr>
+          <w:p>
+            <w:pPr>
+              <w:spacing w:after="0"/>
+            </w:pPr>
+            <w:r/>
+            <w:r>
+              <w:rPr>
+                <w:rFonts w:ascii="Calibri" w:hAnsi="Calibri"/>
+                <w:b w:val="0"/>
+                <w:sz w:val="18"/>
+              </w:rPr>
+              <w:t>Useful for post-pregnancy risk modelling.</w:t>
+            </w:r>
+          </w:p>
+        </w:tc>
+        <w:tc>
+          <w:tcPr>
+            <w:tcW w:type="dxa" w:w="2160"/>
+            <w:vAlign w:val="center"/>
+          </w:tcPr>
+          <w:p>
+            <w:pPr>
+              <w:spacing w:after="0"/>
+            </w:pPr>
+            <w:r/>
+            <w:r>
+              <w:rPr>
+                <w:rFonts w:ascii="Calibri" w:hAnsi="Calibri"/>
+                <w:b w:val="0"/>
+                <w:sz w:val="18"/>
+              </w:rPr>
+              <w:t>Only relevant after pregnancy is confirmed.</w:t>
+            </w:r>
+          </w:p>
+        </w:tc>
+      </w:tr>
+      <w:tr>
+        <w:tc>
+          <w:tcPr>
+            <w:tcW w:type="dxa" w:w="1872"/>
+            <w:vAlign w:val="center"/>
+          </w:tcPr>
+          <w:p>
+            <w:pPr>
+              <w:spacing w:after="0"/>
+            </w:pPr>
+            <w:r/>
+            <w:r>
+              <w:rPr>
+                <w:rFonts w:ascii="Calibri" w:hAnsi="Calibri"/>
+                <w:b w:val="0"/>
+                <w:sz w:val="18"/>
+              </w:rPr>
+              <w:t>Oocyte/mature oocyte yield</w:t>
+            </w:r>
+          </w:p>
+        </w:tc>
+        <w:tc>
+          <w:tcPr>
+            <w:tcW w:type="dxa" w:w="1800"/>
+            <w:vAlign w:val="center"/>
+          </w:tcPr>
+          <w:p>
+            <w:pPr>
+              <w:spacing w:after="0"/>
+            </w:pPr>
+            <w:r/>
+            <w:r>
+              <w:rPr>
+                <w:rFonts w:ascii="Calibri" w:hAnsi="Calibri"/>
+                <w:b w:val="0"/>
+                <w:sz w:val="18"/>
+              </w:rPr>
+              <w:t>Secondary</w:t>
+            </w:r>
+          </w:p>
+        </w:tc>
+        <w:tc>
+          <w:tcPr>
+            <w:tcW w:type="dxa" w:w="3312"/>
+            <w:vAlign w:val="center"/>
+          </w:tcPr>
+          <w:p>
+            <w:pPr>
+              <w:spacing w:after="0"/>
+            </w:pPr>
+            <w:r/>
+            <w:r>
+              <w:rPr>
+                <w:rFonts w:ascii="Calibri" w:hAnsi="Calibri"/>
+                <w:b w:val="0"/>
+                <w:sz w:val="18"/>
+              </w:rPr>
+              <w:t>Useful for ovarian stimulation response.</w:t>
+            </w:r>
+          </w:p>
+        </w:tc>
+        <w:tc>
+          <w:tcPr>
+            <w:tcW w:type="dxa" w:w="2160"/>
+            <w:vAlign w:val="center"/>
+          </w:tcPr>
+          <w:p>
+            <w:pPr>
+              <w:spacing w:after="0"/>
+            </w:pPr>
+            <w:r/>
+            <w:r>
+              <w:rPr>
+                <w:rFonts w:ascii="Calibri" w:hAnsi="Calibri"/>
+                <w:b w:val="0"/>
+                <w:sz w:val="18"/>
+              </w:rPr>
+              <w:t>Different target from pregnancy/live birth.</w:t>
+            </w:r>
+          </w:p>
+        </w:tc>
+      </w:tr>
+      <w:tr>
+        <w:tc>
+          <w:tcPr>
+            <w:tcW w:type="dxa" w:w="1872"/>
+            <w:vAlign w:val="center"/>
+          </w:tcPr>
+          <w:p>
+            <w:pPr>
+              <w:spacing w:after="0"/>
+            </w:pPr>
+            <w:r/>
+            <w:r>
+              <w:rPr>
+                <w:rFonts w:ascii="Calibri" w:hAnsi="Calibri"/>
+                <w:b w:val="0"/>
+                <w:sz w:val="18"/>
+              </w:rPr>
+              <w:t>Good-quality embryo/blastocyst</w:t>
+            </w:r>
+          </w:p>
+        </w:tc>
+        <w:tc>
+          <w:tcPr>
+            <w:tcW w:type="dxa" w:w="1800"/>
+            <w:vAlign w:val="center"/>
+          </w:tcPr>
+          <w:p>
+            <w:pPr>
+              <w:spacing w:after="0"/>
+            </w:pPr>
+            <w:r/>
+            <w:r>
+              <w:rPr>
+                <w:rFonts w:ascii="Calibri" w:hAnsi="Calibri"/>
+                <w:b w:val="0"/>
+                <w:sz w:val="18"/>
+              </w:rPr>
+              <w:t>Secondary</w:t>
+            </w:r>
+          </w:p>
+        </w:tc>
+        <w:tc>
+          <w:tcPr>
+            <w:tcW w:type="dxa" w:w="3312"/>
+            <w:vAlign w:val="center"/>
+          </w:tcPr>
+          <w:p>
+            <w:pPr>
+              <w:spacing w:after="0"/>
+            </w:pPr>
+            <w:r/>
+            <w:r>
+              <w:rPr>
+                <w:rFonts w:ascii="Calibri" w:hAnsi="Calibri"/>
+                <w:b w:val="0"/>
+                <w:sz w:val="18"/>
+              </w:rPr>
+              <w:t>Useful if embryology data exists.</w:t>
+            </w:r>
+          </w:p>
+        </w:tc>
+        <w:tc>
+          <w:tcPr>
+            <w:tcW w:type="dxa" w:w="2160"/>
+            <w:vAlign w:val="center"/>
+          </w:tcPr>
+          <w:p>
+            <w:pPr>
+              <w:spacing w:after="0"/>
+            </w:pPr>
+            <w:r/>
+            <w:r>
+              <w:rPr>
+                <w:rFonts w:ascii="Calibri" w:hAnsi="Calibri"/>
+                <w:b w:val="0"/>
+                <w:sz w:val="18"/>
+              </w:rPr>
+              <w:t>Lab outcome, not final patient outcome.</w:t>
+            </w:r>
+          </w:p>
+        </w:tc>
+      </w:tr>
+    </w:tbl>
+    <w:p/>
+    <w:p>
+      <w:pPr>
+        <w:pStyle w:val="Heading1"/>
+      </w:pPr>
+      <w:r>
+        <w:t>Validation Options</w:t>
+      </w:r>
+    </w:p>
+    <w:tbl>
+      <w:tblPr>
+        <w:tblStyle w:val="TableGrid"/>
+        <w:tblW w:type="auto" w:w="0"/>
+        <w:jc w:val="center"/>
+        <w:tblLook w:firstColumn="1" w:firstRow="1" w:lastColumn="0" w:lastRow="0" w:noHBand="0" w:noVBand="1" w:val="04A0"/>
+      </w:tblPr>
+      <w:tblGrid>
+        <w:gridCol w:w="3120"/>
+        <w:gridCol w:w="3120"/>
+        <w:gridCol w:w="3120"/>
+      </w:tblGrid>
+      <w:tr>
+        <w:tc>
+          <w:tcPr>
+            <w:tcW w:type="dxa" w:w="2088"/>
+            <w:shd w:fill="F2F4F7"/>
+            <w:vAlign w:val="center"/>
+          </w:tcPr>
+          <w:p>
+            <w:pPr>
+              <w:spacing w:after="0"/>
+            </w:pPr>
+            <w:r/>
+            <w:r>
+              <w:rPr>
+                <w:rFonts w:ascii="Calibri" w:hAnsi="Calibri"/>
+                <w:b/>
+                <w:sz w:val="18"/>
+              </w:rPr>
+              <w:t>Validation Type</w:t>
+            </w:r>
+          </w:p>
+        </w:tc>
+        <w:tc>
+          <w:tcPr>
+            <w:tcW w:type="dxa" w:w="3384"/>
+            <w:shd w:fill="F2F4F7"/>
+            <w:vAlign w:val="center"/>
+          </w:tcPr>
+          <w:p>
+            <w:pPr>
+              <w:spacing w:after="0"/>
+            </w:pPr>
+            <w:r/>
+            <w:r>
+              <w:rPr>
+                <w:rFonts w:ascii="Calibri" w:hAnsi="Calibri"/>
+                <w:b/>
+                <w:sz w:val="18"/>
+              </w:rPr>
+              <w:t>When It Is Possible</w:t>
+            </w:r>
+          </w:p>
+        </w:tc>
+        <w:tc>
+          <w:tcPr>
+            <w:tcW w:type="dxa" w:w="3600"/>
+            <w:shd w:fill="F2F4F7"/>
+            <w:vAlign w:val="center"/>
+          </w:tcPr>
+          <w:p>
+            <w:pPr>
+              <w:spacing w:after="0"/>
+            </w:pPr>
+            <w:r/>
+            <w:r>
+              <w:rPr>
+                <w:rFonts w:ascii="Calibri" w:hAnsi="Calibri"/>
+                <w:b/>
+                <w:sz w:val="18"/>
+              </w:rPr>
+              <w:t>How To Word It Safely</w:t>
+            </w:r>
+          </w:p>
+        </w:tc>
+      </w:tr>
+      <w:tr>
+        <w:tc>
+          <w:tcPr>
+            <w:tcW w:type="dxa" w:w="2088"/>
+            <w:vAlign w:val="center"/>
+          </w:tcPr>
+          <w:p>
+            <w:pPr>
+              <w:spacing w:after="0"/>
+            </w:pPr>
+            <w:r/>
+            <w:r>
+              <w:rPr>
+                <w:rFonts w:ascii="Calibri" w:hAnsi="Calibri"/>
+                <w:b w:val="0"/>
+                <w:sz w:val="18"/>
+              </w:rPr>
+              <w:t>Internal validation</w:t>
+            </w:r>
+          </w:p>
+        </w:tc>
+        <w:tc>
+          <w:tcPr>
+            <w:tcW w:type="dxa" w:w="3384"/>
+            <w:vAlign w:val="center"/>
+          </w:tcPr>
+          <w:p>
+            <w:pPr>
+              <w:spacing w:after="0"/>
+            </w:pPr>
+            <w:r/>
+            <w:r>
+              <w:rPr>
+                <w:rFonts w:ascii="Calibri" w:hAnsi="Calibri"/>
+                <w:b w:val="0"/>
+                <w:sz w:val="18"/>
+              </w:rPr>
+              <w:t>One dataset from one clinic.</w:t>
+            </w:r>
+          </w:p>
+        </w:tc>
+        <w:tc>
+          <w:tcPr>
+            <w:tcW w:type="dxa" w:w="3600"/>
+            <w:vAlign w:val="center"/>
+          </w:tcPr>
+          <w:p>
+            <w:pPr>
+              <w:spacing w:after="0"/>
+            </w:pPr>
+            <w:r/>
+            <w:r>
+              <w:rPr>
+                <w:rFonts w:ascii="Calibri" w:hAnsi="Calibri"/>
+                <w:b w:val="0"/>
+                <w:sz w:val="18"/>
+              </w:rPr>
+              <w:t>Internal model validation only.</w:t>
+            </w:r>
+          </w:p>
+        </w:tc>
+      </w:tr>
+      <w:tr>
+        <w:tc>
+          <w:tcPr>
+            <w:tcW w:type="dxa" w:w="2088"/>
+            <w:vAlign w:val="center"/>
+          </w:tcPr>
+          <w:p>
+            <w:pPr>
+              <w:spacing w:after="0"/>
+            </w:pPr>
+            <w:r/>
+            <w:r>
+              <w:rPr>
+                <w:rFonts w:ascii="Calibri" w:hAnsi="Calibri"/>
+                <w:b w:val="0"/>
+                <w:sz w:val="18"/>
+              </w:rPr>
+              <w:t>Temporal validation</w:t>
+            </w:r>
+          </w:p>
+        </w:tc>
+        <w:tc>
+          <w:tcPr>
+            <w:tcW w:type="dxa" w:w="3384"/>
+            <w:vAlign w:val="center"/>
+          </w:tcPr>
+          <w:p>
+            <w:pPr>
+              <w:spacing w:after="0"/>
+            </w:pPr>
+            <w:r/>
+            <w:r>
+              <w:rPr>
+                <w:rFonts w:ascii="Calibri" w:hAnsi="Calibri"/>
+                <w:b w:val="0"/>
+                <w:sz w:val="18"/>
+              </w:rPr>
+              <w:t>Same clinic, later years held out.</w:t>
+            </w:r>
+          </w:p>
+        </w:tc>
+        <w:tc>
+          <w:tcPr>
+            <w:tcW w:type="dxa" w:w="3600"/>
+            <w:vAlign w:val="center"/>
+          </w:tcPr>
+          <w:p>
+            <w:pPr>
+              <w:spacing w:after="0"/>
+            </w:pPr>
+            <w:r/>
+            <w:r>
+              <w:rPr>
+                <w:rFonts w:ascii="Calibri" w:hAnsi="Calibri"/>
+                <w:b w:val="0"/>
+                <w:sz w:val="18"/>
+              </w:rPr>
+              <w:t>Validation on a later time period.</w:t>
+            </w:r>
+          </w:p>
+        </w:tc>
+      </w:tr>
+      <w:tr>
+        <w:tc>
+          <w:tcPr>
+            <w:tcW w:type="dxa" w:w="2088"/>
+            <w:vAlign w:val="center"/>
+          </w:tcPr>
+          <w:p>
+            <w:pPr>
+              <w:spacing w:after="0"/>
+            </w:pPr>
+            <w:r/>
+            <w:r>
+              <w:rPr>
+                <w:rFonts w:ascii="Calibri" w:hAnsi="Calibri"/>
+                <w:b w:val="0"/>
+                <w:sz w:val="18"/>
+              </w:rPr>
+              <w:t>External validation</w:t>
+            </w:r>
+          </w:p>
+        </w:tc>
+        <w:tc>
+          <w:tcPr>
+            <w:tcW w:type="dxa" w:w="3384"/>
+            <w:vAlign w:val="center"/>
+          </w:tcPr>
+          <w:p>
+            <w:pPr>
+              <w:spacing w:after="0"/>
+            </w:pPr>
+            <w:r/>
+            <w:r>
+              <w:rPr>
+                <w:rFonts w:ascii="Calibri" w:hAnsi="Calibri"/>
+                <w:b w:val="0"/>
+                <w:sz w:val="18"/>
+              </w:rPr>
+              <w:t>Different clinic/source/system.</w:t>
+            </w:r>
+          </w:p>
+        </w:tc>
+        <w:tc>
+          <w:tcPr>
+            <w:tcW w:type="dxa" w:w="3600"/>
+            <w:vAlign w:val="center"/>
+          </w:tcPr>
+          <w:p>
+            <w:pPr>
+              <w:spacing w:after="0"/>
+            </w:pPr>
+            <w:r/>
+            <w:r>
+              <w:rPr>
+                <w:rFonts w:ascii="Calibri" w:hAnsi="Calibri"/>
+                <w:b w:val="0"/>
+                <w:sz w:val="18"/>
+              </w:rPr>
+              <w:t>External validation, if truly independent.</w:t>
+            </w:r>
+          </w:p>
+        </w:tc>
+      </w:tr>
+      <w:tr>
+        <w:tc>
+          <w:tcPr>
+            <w:tcW w:type="dxa" w:w="2088"/>
+            <w:vAlign w:val="center"/>
+          </w:tcPr>
+          <w:p>
+            <w:pPr>
+              <w:spacing w:after="0"/>
+            </w:pPr>
+            <w:r/>
+            <w:r>
+              <w:rPr>
+                <w:rFonts w:ascii="Calibri" w:hAnsi="Calibri"/>
+                <w:b w:val="0"/>
+                <w:sz w:val="18"/>
+              </w:rPr>
+              <w:t>Subgroup validation</w:t>
+            </w:r>
+          </w:p>
+        </w:tc>
+        <w:tc>
+          <w:tcPr>
+            <w:tcW w:type="dxa" w:w="3384"/>
+            <w:vAlign w:val="center"/>
+          </w:tcPr>
+          <w:p>
+            <w:pPr>
+              <w:spacing w:after="0"/>
+            </w:pPr>
+            <w:r/>
+            <w:r>
+              <w:rPr>
+                <w:rFonts w:ascii="Calibri" w:hAnsi="Calibri"/>
+                <w:b w:val="0"/>
+                <w:sz w:val="18"/>
+              </w:rPr>
+              <w:t>Adequate sample sizes by age, diagnosis, PCOS/endometriosis etc.</w:t>
+            </w:r>
+          </w:p>
+        </w:tc>
+        <w:tc>
+          <w:tcPr>
+            <w:tcW w:type="dxa" w:w="3600"/>
+            <w:vAlign w:val="center"/>
+          </w:tcPr>
+          <w:p>
+            <w:pPr>
+              <w:spacing w:after="0"/>
+            </w:pPr>
+            <w:r/>
+            <w:r>
+              <w:rPr>
+                <w:rFonts w:ascii="Calibri" w:hAnsi="Calibri"/>
+                <w:b w:val="0"/>
+                <w:sz w:val="18"/>
+              </w:rPr>
+              <w:t>Subgroup performance analysis, not proof of fairness unless designed properly.</w:t>
+            </w:r>
+          </w:p>
+        </w:tc>
+      </w:tr>
+    </w:tbl>
+    <w:p/>
+    <w:p>
+      <w:pPr>
+        <w:pStyle w:val="Heading1"/>
+      </w:pPr>
+      <w:r>
+        <w:t>Ethics and Privacy Requirements</w:t>
       </w:r>
     </w:p>
     <w:p>
@@ -368,7 +2773,7 @@
         <w:pStyle w:val="ListBullet"/>
       </w:pPr>
       <w:r>
-        <w:t>More than one clinic or one independent time period for validation.</w:t>
+        <w:t>Use anonymized or de-identified patient/cycle IDs; direct identifiers should not enter the research dataset.</w:t>
       </w:r>
     </w:p>
     <w:p>
@@ -376,7 +2781,7 @@
         <w:pStyle w:val="ListBullet"/>
       </w:pPr>
       <w:r>
-        <w:t>Clinician review of explanation outputs.</w:t>
+        <w:t>Confirm whether ethics committee approval, clinic permission and data-use agreement are required.</w:t>
       </w:r>
     </w:p>
     <w:p>
@@ -384,7 +2789,15 @@
         <w:pStyle w:val="ListBullet"/>
       </w:pPr>
       <w:r>
-        <w:t>Ethics approval and anonymization process clearly documented.</w:t>
+        <w:t>Handle sensitive data carefully: income, occupation, doctor/embryologist IDs, embryo images, genetic/ploidy data and lifestyle details.</w:t>
+      </w:r>
+    </w:p>
+    <w:p>
+      <w:pPr>
+        <w:pStyle w:val="ListBullet"/>
+      </w:pPr>
+      <w:r>
+        <w:t>Keep the system framed as clinical decision support; the model should not make autonomous treatment decisions.</w:t>
       </w:r>
     </w:p>
     <w:p>
@@ -416,7 +2829,23 @@
         <w:pStyle w:val="ListNumber"/>
       </w:pPr>
       <w:r>
+        <w:t>Approximately how many IVF cycles are available, and from which years?</w:t>
+      </w:r>
+    </w:p>
+    <w:p>
+      <w:pPr>
+        <w:pStyle w:val="ListNumber"/>
+      </w:pPr>
+      <w:r>
         <w:t>Are embryology variables available in structured form?</w:t>
+      </w:r>
+    </w:p>
+    <w:p>
+      <w:pPr>
+        <w:pStyle w:val="ListNumber"/>
+      </w:pPr>
+      <w:r>
+        <w:t>Are stimulation dose, trigger and follicle-monitoring variables available?</w:t>
       </w:r>
     </w:p>
     <w:p>
@@ -444,6 +2873,14 @@
       </w:r>
     </w:p>
     <w:p>
+      <w:pPr>
+        <w:pStyle w:val="ListNumber"/>
+      </w:pPr>
+      <w:r>
+        <w:t>What anonymization, permission and ethics process will be required?</w:t>
+      </w:r>
+    </w:p>
+    <w:p>
       <w:r>
         <w:br w:type="page"/>
       </w:r>
@@ -464,13 +2901,14 @@
         <w:tblLook w:firstColumn="1" w:firstRow="1" w:lastColumn="0" w:lastRow="0" w:noHBand="0" w:noVBand="1" w:val="04A0"/>
       </w:tblPr>
       <w:tblGrid>
-        <w:gridCol w:w="4680"/>
-        <w:gridCol w:w="4680"/>
+        <w:gridCol w:w="3120"/>
+        <w:gridCol w:w="3120"/>
+        <w:gridCol w:w="3120"/>
       </w:tblGrid>
       <w:tr>
         <w:tc>
           <w:tcPr>
-            <w:tcW w:type="dxa" w:w="2880"/>
+            <w:tcW w:type="dxa" w:w="2592"/>
             <w:shd w:fill="F2F4F7"/>
             <w:vAlign w:val="center"/>
           </w:tcPr>
@@ -491,7 +2929,7 @@
         </w:tc>
         <w:tc>
           <w:tcPr>
-            <w:tcW w:type="dxa" w:w="6192"/>
+            <w:tcW w:type="dxa" w:w="3672"/>
             <w:shd w:fill="F2F4F7"/>
             <w:vAlign w:val="center"/>
           </w:tcPr>
@@ -510,11 +2948,32 @@
             </w:r>
           </w:p>
         </w:tc>
+        <w:tc>
+          <w:tcPr>
+            <w:tcW w:type="dxa" w:w="2808"/>
+            <w:shd w:fill="F2F4F7"/>
+            <w:vAlign w:val="center"/>
+          </w:tcPr>
+          <w:p>
+            <w:pPr>
+              <w:spacing w:after="0"/>
+            </w:pPr>
+            <w:r/>
+            <w:r>
+              <w:rPr>
+                <w:rFonts w:ascii="Calibri" w:hAnsi="Calibri"/>
+                <w:b/>
+                <w:sz w:val="18"/>
+              </w:rPr>
+              <w:t>Avoid Claiming</w:t>
+            </w:r>
+          </w:p>
+        </w:tc>
       </w:tr>
       <w:tr>
         <w:tc>
           <w:tcPr>
-            <w:tcW w:type="dxa" w:w="2880"/>
+            <w:tcW w:type="dxa" w:w="2592"/>
             <w:vAlign w:val="center"/>
           </w:tcPr>
           <w:p>
@@ -534,7 +2993,7 @@
         </w:tc>
         <w:tc>
           <w:tcPr>
-            <w:tcW w:type="dxa" w:w="6192"/>
+            <w:tcW w:type="dxa" w:w="3672"/>
             <w:vAlign w:val="center"/>
           </w:tcPr>
           <w:p>
@@ -552,11 +3011,31 @@
             </w:r>
           </w:p>
         </w:tc>
+        <w:tc>
+          <w:tcPr>
+            <w:tcW w:type="dxa" w:w="2808"/>
+            <w:vAlign w:val="center"/>
+          </w:tcPr>
+          <w:p>
+            <w:pPr>
+              <w:spacing w:after="0"/>
+            </w:pPr>
+            <w:r/>
+            <w:r>
+              <w:rPr>
+                <w:rFonts w:ascii="Calibri" w:hAnsi="Calibri"/>
+                <w:b w:val="0"/>
+                <w:sz w:val="18"/>
+              </w:rPr>
+              <w:t>Multimodal or embryology-based title.</w:t>
+            </w:r>
+          </w:p>
+        </w:tc>
       </w:tr>
       <w:tr>
         <w:tc>
           <w:tcPr>
-            <w:tcW w:type="dxa" w:w="2880"/>
+            <w:tcW w:type="dxa" w:w="2592"/>
             <w:vAlign w:val="center"/>
           </w:tcPr>
           <w:p>
@@ -576,7 +3055,7 @@
         </w:tc>
         <w:tc>
           <w:tcPr>
-            <w:tcW w:type="dxa" w:w="6192"/>
+            <w:tcW w:type="dxa" w:w="3672"/>
             <w:vAlign w:val="center"/>
           </w:tcPr>
           <w:p>
@@ -594,11 +3073,31 @@
             </w:r>
           </w:p>
         </w:tc>
+        <w:tc>
+          <w:tcPr>
+            <w:tcW w:type="dxa" w:w="2808"/>
+            <w:vAlign w:val="center"/>
+          </w:tcPr>
+          <w:p>
+            <w:pPr>
+              <w:spacing w:after="0"/>
+            </w:pPr>
+            <w:r/>
+            <w:r>
+              <w:rPr>
+                <w:rFonts w:ascii="Calibri" w:hAnsi="Calibri"/>
+                <w:b w:val="0"/>
+                <w:sz w:val="18"/>
+              </w:rPr>
+              <w:t>Image/deep-learning claims unless images are available.</w:t>
+            </w:r>
+          </w:p>
+        </w:tc>
       </w:tr>
       <w:tr>
         <w:tc>
           <w:tcPr>
-            <w:tcW w:type="dxa" w:w="2880"/>
+            <w:tcW w:type="dxa" w:w="2592"/>
             <w:vAlign w:val="center"/>
           </w:tcPr>
           <w:p>
@@ -618,7 +3117,7 @@
         </w:tc>
         <w:tc>
           <w:tcPr>
-            <w:tcW w:type="dxa" w:w="6192"/>
+            <w:tcW w:type="dxa" w:w="3672"/>
             <w:vAlign w:val="center"/>
           </w:tcPr>
           <w:p>
@@ -636,11 +3135,9 @@
             </w:r>
           </w:p>
         </w:tc>
-      </w:tr>
-      <w:tr>
         <w:tc>
           <w:tcPr>
-            <w:tcW w:type="dxa" w:w="2880"/>
+            <w:tcW w:type="dxa" w:w="2808"/>
             <w:vAlign w:val="center"/>
           </w:tcPr>
           <w:p>
@@ -654,13 +3151,35 @@
                 <w:b w:val="0"/>
                 <w:sz w:val="18"/>
               </w:rPr>
-              <w:t>Multi-center data</w:t>
+              <w:t>Lifestyle effect claims without reliable measurement.</w:t>
+            </w:r>
+          </w:p>
+        </w:tc>
+      </w:tr>
+      <w:tr>
+        <w:tc>
+          <w:tcPr>
+            <w:tcW w:type="dxa" w:w="2592"/>
+            <w:vAlign w:val="center"/>
+          </w:tcPr>
+          <w:p>
+            <w:pPr>
+              <w:spacing w:after="0"/>
+            </w:pPr>
+            <w:r/>
+            <w:r>
+              <w:rPr>
+                <w:rFonts w:ascii="Calibri" w:hAnsi="Calibri"/>
+                <w:b w:val="0"/>
+                <w:sz w:val="18"/>
+              </w:rPr>
+              <w:t>Independent clinic/source</w:t>
             </w:r>
           </w:p>
         </w:tc>
         <w:tc>
           <w:tcPr>
-            <w:tcW w:type="dxa" w:w="6192"/>
+            <w:tcW w:type="dxa" w:w="3672"/>
             <w:vAlign w:val="center"/>
           </w:tcPr>
           <w:p>
@@ -678,9 +3197,104 @@
             </w:r>
           </w:p>
         </w:tc>
+        <w:tc>
+          <w:tcPr>
+            <w:tcW w:type="dxa" w:w="2808"/>
+            <w:vAlign w:val="center"/>
+          </w:tcPr>
+          <w:p>
+            <w:pPr>
+              <w:spacing w:after="0"/>
+            </w:pPr>
+            <w:r/>
+            <w:r>
+              <w:rPr>
+                <w:rFonts w:ascii="Calibri" w:hAnsi="Calibri"/>
+                <w:b w:val="0"/>
+                <w:sz w:val="18"/>
+              </w:rPr>
+              <w:t>External validation if only one-center internal split exists.</w:t>
+            </w:r>
+          </w:p>
+        </w:tc>
+      </w:tr>
+      <w:tr>
+        <w:tc>
+          <w:tcPr>
+            <w:tcW w:type="dxa" w:w="2592"/>
+            <w:vAlign w:val="center"/>
+          </w:tcPr>
+          <w:p>
+            <w:pPr>
+              <w:spacing w:after="0"/>
+            </w:pPr>
+            <w:r/>
+            <w:r>
+              <w:rPr>
+                <w:rFonts w:ascii="Calibri" w:hAnsi="Calibri"/>
+                <w:b w:val="0"/>
+                <w:sz w:val="18"/>
+              </w:rPr>
+              <w:t>Clinician review possible</w:t>
+            </w:r>
+          </w:p>
+        </w:tc>
+        <w:tc>
+          <w:tcPr>
+            <w:tcW w:type="dxa" w:w="3672"/>
+            <w:vAlign w:val="center"/>
+          </w:tcPr>
+          <w:p>
+            <w:pPr>
+              <w:spacing w:after="0"/>
+            </w:pPr>
+            <w:r/>
+            <w:r>
+              <w:rPr>
+                <w:rFonts w:ascii="Calibri" w:hAnsi="Calibri"/>
+                <w:b w:val="0"/>
+                <w:sz w:val="18"/>
+              </w:rPr>
+              <w:t>Clinician-facing explanation/usability evaluation can be added.</w:t>
+            </w:r>
+          </w:p>
+        </w:tc>
+        <w:tc>
+          <w:tcPr>
+            <w:tcW w:type="dxa" w:w="2808"/>
+            <w:vAlign w:val="center"/>
+          </w:tcPr>
+          <w:p>
+            <w:pPr>
+              <w:spacing w:after="0"/>
+            </w:pPr>
+            <w:r/>
+            <w:r>
+              <w:rPr>
+                <w:rFonts w:ascii="Calibri" w:hAnsi="Calibri"/>
+                <w:b w:val="0"/>
+                <w:sz w:val="18"/>
+              </w:rPr>
+              <w:t>Clinical deployment or improved success rate.</w:t>
+            </w:r>
+          </w:p>
+        </w:tc>
       </w:tr>
     </w:tbl>
     <w:p/>
+    <w:p>
+      <w:pPr>
+        <w:pStyle w:val="Heading1"/>
+      </w:pPr>
+      <w:r>
+        <w:t>Current Safe Position For Guide</w:t>
+      </w:r>
+    </w:p>
+    <w:p>
+      <w:r>
+        <w:t>The safest current position is that the PhD direction is dataset-dependent. A clinical-data-only study is still possible, but the stronger topic is clinical plus embryological data with explainability and decision-support framing. Indian validation, lifestyle data, external validation and clinician usability should remain conditional until data access is confirmed.</w:t>
+      </w:r>
+    </w:p>
     <w:sectPr>
       <w:pgSz w:w="12240" w:h="15840"/>
       <w:pgMar w:top="1440" w:right="1440" w:bottom="1440" w:left="1440" w:header="720" w:footer="720" w:gutter="0"/>

</xml_diff>